<commit_message>
Final delivery: author info, refined 10-page presentation, reproducibility cleanup
</commit_message>
<xml_diff>
--- a/paper/正态分布在现实数据分析中的应用_基于中国成年人身高数据的案例分析.docx
+++ b/paper/正态分布在现实数据分析中的应用_基于中国成年人身高数据的案例分析.docx
@@ -86,14 +86,7 @@
           <w:rFonts w:eastAsia="宋体" w:ascii="Times New Roman" w:hAnsi="Times New Roman"/>
           <w:sz w:val="30"/>
         </w:rPr>
-        <w:t>作 者：</w:t>
-      </w:r>
-      <w:r>
-        <w:rPr>
-          <w:rFonts w:eastAsia="宋体" w:ascii="Times New Roman" w:hAnsi="Times New Roman"/>
-          <w:sz w:val="30"/>
-        </w:rPr>
-        <w:t>＿＿＿＿＿＿＿＿＿＿</w:t>
+        <w:t>作    者：赵浩、章轩睿</w:t>
       </w:r>
     </w:p>
     <w:p>
@@ -107,14 +100,7 @@
           <w:rFonts w:eastAsia="宋体" w:ascii="Times New Roman" w:hAnsi="Times New Roman"/>
           <w:sz w:val="30"/>
         </w:rPr>
-        <w:t>学 号：</w:t>
-      </w:r>
-      <w:r>
-        <w:rPr>
-          <w:rFonts w:eastAsia="宋体" w:ascii="Times New Roman" w:hAnsi="Times New Roman"/>
-          <w:sz w:val="30"/>
-        </w:rPr>
-        <w:t>＿＿＿＿＿＿＿＿＿＿</w:t>
+        <w:t>学    号：U202541916、U202541911</w:t>
       </w:r>
     </w:p>
     <w:p>
@@ -128,14 +114,7 @@
           <w:rFonts w:eastAsia="宋体" w:ascii="Times New Roman" w:hAnsi="Times New Roman"/>
           <w:sz w:val="30"/>
         </w:rPr>
-        <w:t>日 期：</w:t>
-      </w:r>
-      <w:r>
-        <w:rPr>
-          <w:rFonts w:eastAsia="宋体" w:ascii="Times New Roman" w:hAnsi="Times New Roman"/>
-          <w:sz w:val="30"/>
-        </w:rPr>
-        <w:t>＿＿＿＿年＿＿月＿＿日</w:t>
+        <w:t>日    期：2026年9月26日</w:t>
       </w:r>
     </w:p>
     <w:p>

</xml_diff>

<commit_message>
Final delivery: unified member info (Zhao Hao, Zhang Luxi), presenter badge on cover slide, README consistency fixes
- Unify members to 赵浩（U202541916）、张璐玺（U202541915）across paper cover, PPT slide 1, script and README
- Add presenter info bar (汇报人：张璐玺) to PPT cover slide
- README: 11 pages -> 10 pages; replace inaccurate vector-typesetting wording; remove outdated helper script
</commit_message>
<xml_diff>
--- a/paper/正态分布在现实数据分析中的应用_基于中国成年人身高数据的案例分析.docx
+++ b/paper/正态分布在现实数据分析中的应用_基于中国成年人身高数据的案例分析.docx
@@ -82,11 +82,7 @@
         <w:ind w:left="1364"/>
       </w:pPr>
       <w:r>
-        <w:rPr>
-          <w:rFonts w:eastAsia="宋体" w:ascii="Times New Roman" w:hAnsi="Times New Roman"/>
-          <w:sz w:val="30"/>
-        </w:rPr>
-        <w:t>作    者：赵浩、章轩睿</w:t>
+        <w:t>作    者：赵浩、张璐玺</w:t>
       </w:r>
     </w:p>
     <w:p>
@@ -96,11 +92,7 @@
         <w:ind w:left="1364"/>
       </w:pPr>
       <w:r>
-        <w:rPr>
-          <w:rFonts w:eastAsia="宋体" w:ascii="Times New Roman" w:hAnsi="Times New Roman"/>
-          <w:sz w:val="30"/>
-        </w:rPr>
-        <w:t>学    号：U202541916、U202541911</w:t>
+        <w:t>学    号：U202541916、U202541915</w:t>
       </w:r>
     </w:p>
     <w:p>

</xml_diff>